<commit_message>
docs: cap nhat Singleton Pattern trong DESIGN_PATTERNS.docx voi code that
SettingsManager da duoc lap trinh (xem commit truoc), nen chuyen phan
Singleton tu "ghi chu du kien, chua trien khai" thanh muc 8 day du, dung
dinh dang voi 7 pattern con lai: code snippet that, Ap dung cho / Mo ta /
Ly do chon / Han che (co giai thich ro Singleton nay la "theo vong doi
request" do dac thu PHP, khong giu state xuyen tien trinh nhu Java/C++).
</commit_message>
<xml_diff>
--- a/docs/DESIGN_PATTERNS.docx
+++ b/docs/DESIGN_PATTERNS.docx
@@ -2425,22 +2425,401 @@
     </w:p>
     <w:p>
       <w:pPr>
-        <w:spacing w:before="360" w:after="120"/>
-      </w:pPr>
-      <w:r>
-        <w:rPr>
-          <w:b/>
-          <w:sz w:val="26"/>
-        </w:rPr>
-        <w:t xml:space="preserve">Ghi chú — mẫu dự kiến, chưa triển khai trong phạm vi hiện tại</w:t>
-      </w:r>
-    </w:p>
-    <w:p>
-      <w:pPr>
-        <w:ind w:left="240"/>
-      </w:pPr>
-      <w:r>
-        <w:t xml:space="preserve">Singleton Pattern: giao diện Vue có ghi chú dự kiến nối module Cấu hình hệ thống (Settings) với một SettingsManager theo mẫu Singleton (đảm bảo chỉ một instance đọc/ghi bảng settings dùng chung toàn hệ thống). Module Cấu hình hệ thống chưa được lập trình, chỉ nêu ở đây để theo dõi cho lần triển khai kế tiếp.</w:t>
+        <w:spacing w:before="280" w:after="80"/>
+      </w:pPr>
+      <w:r>
+        <w:rPr>
+          <w:b/>
+          <w:sz w:val="28"/>
+        </w:rPr>
+        <w:t xml:space="preserve">8. Singleton Pattern</w:t>
+      </w:r>
+    </w:p>
+    <w:p>
+      <w:pPr>
+        <w:spacing w:after="120"/>
+        <w:ind w:left="240"/>
+      </w:pPr>
+      <w:r>
+        <w:rPr>
+          <w:b/>
+        </w:rPr>
+        <w:t xml:space="preserve">File: </w:t>
+      </w:r>
+      <w:r>
+        <w:rPr>
+          <w:rFonts w:ascii="Consolas" w:hAnsi="Consolas"/>
+          <w:sz w:val="18"/>
+        </w:rPr>
+        <w:t xml:space="preserve">app/Services/SettingsManager.php</w:t>
+      </w:r>
+    </w:p>
+    <w:p>
+      <w:pPr>
+        <w:ind w:left="240"/>
+        <w:spacing w:after="0"/>
+        <w:shd w:val="clear" w:fill="F2F2F2"/>
+      </w:pPr>
+      <w:r>
+        <w:rPr>
+          <w:rFonts w:ascii="Consolas" w:hAnsi="Consolas"/>
+          <w:sz w:val="18"/>
+        </w:rPr>
+        <w:t xml:space="preserve">final class SettingsManager</w:t>
+      </w:r>
+    </w:p>
+    <w:p>
+      <w:pPr>
+        <w:ind w:left="240"/>
+        <w:spacing w:after="0"/>
+        <w:shd w:val="clear" w:fill="F2F2F2"/>
+      </w:pPr>
+      <w:r>
+        <w:rPr>
+          <w:rFonts w:ascii="Consolas" w:hAnsi="Consolas"/>
+          <w:sz w:val="18"/>
+        </w:rPr>
+        <w:t xml:space="preserve">{</w:t>
+      </w:r>
+    </w:p>
+    <w:p>
+      <w:pPr>
+        <w:ind w:left="240"/>
+        <w:spacing w:after="0"/>
+        <w:shd w:val="clear" w:fill="F2F2F2"/>
+      </w:pPr>
+      <w:r>
+        <w:rPr>
+          <w:rFonts w:ascii="Consolas" w:hAnsi="Consolas"/>
+          <w:sz w:val="18"/>
+        </w:rPr>
+        <w:t xml:space="preserve">    private static ?self $instance = null;</w:t>
+      </w:r>
+    </w:p>
+    <w:p>
+      <w:pPr>
+        <w:ind w:left="240"/>
+        <w:spacing w:after="0"/>
+        <w:shd w:val="clear" w:fill="F2F2F2"/>
+      </w:pPr>
+      <w:r>
+        <w:rPr>
+          <w:rFonts w:ascii="Consolas" w:hAnsi="Consolas"/>
+          <w:sz w:val="18"/>
+        </w:rPr>
+        <w:t xml:space="preserve"/>
+      </w:r>
+    </w:p>
+    <w:p>
+      <w:pPr>
+        <w:ind w:left="240"/>
+        <w:spacing w:after="0"/>
+        <w:shd w:val="clear" w:fill="F2F2F2"/>
+      </w:pPr>
+      <w:r>
+        <w:rPr>
+          <w:rFonts w:ascii="Consolas" w:hAnsi="Consolas"/>
+          <w:sz w:val="18"/>
+        </w:rPr>
+        <w:t xml:space="preserve">    private array $cache;</w:t>
+      </w:r>
+    </w:p>
+    <w:p>
+      <w:pPr>
+        <w:ind w:left="240"/>
+        <w:spacing w:after="0"/>
+        <w:shd w:val="clear" w:fill="F2F2F2"/>
+      </w:pPr>
+      <w:r>
+        <w:rPr>
+          <w:rFonts w:ascii="Consolas" w:hAnsi="Consolas"/>
+          <w:sz w:val="18"/>
+        </w:rPr>
+        <w:t xml:space="preserve"/>
+      </w:r>
+    </w:p>
+    <w:p>
+      <w:pPr>
+        <w:ind w:left="240"/>
+        <w:spacing w:after="0"/>
+        <w:shd w:val="clear" w:fill="F2F2F2"/>
+      </w:pPr>
+      <w:r>
+        <w:rPr>
+          <w:rFonts w:ascii="Consolas" w:hAnsi="Consolas"/>
+          <w:sz w:val="18"/>
+        </w:rPr>
+        <w:t xml:space="preserve">    private function __construct()</w:t>
+      </w:r>
+    </w:p>
+    <w:p>
+      <w:pPr>
+        <w:ind w:left="240"/>
+        <w:spacing w:after="0"/>
+        <w:shd w:val="clear" w:fill="F2F2F2"/>
+      </w:pPr>
+      <w:r>
+        <w:rPr>
+          <w:rFonts w:ascii="Consolas" w:hAnsi="Consolas"/>
+          <w:sz w:val="18"/>
+        </w:rPr>
+        <w:t xml:space="preserve">    {</w:t>
+      </w:r>
+    </w:p>
+    <w:p>
+      <w:pPr>
+        <w:ind w:left="240"/>
+        <w:spacing w:after="0"/>
+        <w:shd w:val="clear" w:fill="F2F2F2"/>
+      </w:pPr>
+      <w:r>
+        <w:rPr>
+          <w:rFonts w:ascii="Consolas" w:hAnsi="Consolas"/>
+          <w:sz w:val="18"/>
+        </w:rPr>
+        <w:t xml:space="preserve">        $this-&gt;cache = Setting::query()-&gt;pluck('value', 'key')-&gt;all();</w:t>
+      </w:r>
+    </w:p>
+    <w:p>
+      <w:pPr>
+        <w:ind w:left="240"/>
+        <w:spacing w:after="0"/>
+        <w:shd w:val="clear" w:fill="F2F2F2"/>
+      </w:pPr>
+      <w:r>
+        <w:rPr>
+          <w:rFonts w:ascii="Consolas" w:hAnsi="Consolas"/>
+          <w:sz w:val="18"/>
+        </w:rPr>
+        <w:t xml:space="preserve">    }</w:t>
+      </w:r>
+    </w:p>
+    <w:p>
+      <w:pPr>
+        <w:ind w:left="240"/>
+        <w:spacing w:after="0"/>
+        <w:shd w:val="clear" w:fill="F2F2F2"/>
+      </w:pPr>
+      <w:r>
+        <w:rPr>
+          <w:rFonts w:ascii="Consolas" w:hAnsi="Consolas"/>
+          <w:sz w:val="18"/>
+        </w:rPr>
+        <w:t xml:space="preserve"/>
+      </w:r>
+    </w:p>
+    <w:p>
+      <w:pPr>
+        <w:ind w:left="240"/>
+        <w:spacing w:after="0"/>
+        <w:shd w:val="clear" w:fill="F2F2F2"/>
+      </w:pPr>
+      <w:r>
+        <w:rPr>
+          <w:rFonts w:ascii="Consolas" w:hAnsi="Consolas"/>
+          <w:sz w:val="18"/>
+        </w:rPr>
+        <w:t xml:space="preserve">    public static function instance(): self</w:t>
+      </w:r>
+    </w:p>
+    <w:p>
+      <w:pPr>
+        <w:ind w:left="240"/>
+        <w:spacing w:after="0"/>
+        <w:shd w:val="clear" w:fill="F2F2F2"/>
+      </w:pPr>
+      <w:r>
+        <w:rPr>
+          <w:rFonts w:ascii="Consolas" w:hAnsi="Consolas"/>
+          <w:sz w:val="18"/>
+        </w:rPr>
+        <w:t xml:space="preserve">    {</w:t>
+      </w:r>
+    </w:p>
+    <w:p>
+      <w:pPr>
+        <w:ind w:left="240"/>
+        <w:spacing w:after="0"/>
+        <w:shd w:val="clear" w:fill="F2F2F2"/>
+      </w:pPr>
+      <w:r>
+        <w:rPr>
+          <w:rFonts w:ascii="Consolas" w:hAnsi="Consolas"/>
+          <w:sz w:val="18"/>
+        </w:rPr>
+        <w:t xml:space="preserve">        return self::$instance ??= new self();</w:t>
+      </w:r>
+    </w:p>
+    <w:p>
+      <w:pPr>
+        <w:ind w:left="240"/>
+        <w:spacing w:after="0"/>
+        <w:shd w:val="clear" w:fill="F2F2F2"/>
+      </w:pPr>
+      <w:r>
+        <w:rPr>
+          <w:rFonts w:ascii="Consolas" w:hAnsi="Consolas"/>
+          <w:sz w:val="18"/>
+        </w:rPr>
+        <w:t xml:space="preserve">    }</w:t>
+      </w:r>
+    </w:p>
+    <w:p>
+      <w:pPr>
+        <w:ind w:left="240"/>
+        <w:spacing w:after="0"/>
+        <w:shd w:val="clear" w:fill="F2F2F2"/>
+      </w:pPr>
+      <w:r>
+        <w:rPr>
+          <w:rFonts w:ascii="Consolas" w:hAnsi="Consolas"/>
+          <w:sz w:val="18"/>
+        </w:rPr>
+        <w:t xml:space="preserve"/>
+      </w:r>
+    </w:p>
+    <w:p>
+      <w:pPr>
+        <w:ind w:left="240"/>
+        <w:spacing w:after="0"/>
+        <w:shd w:val="clear" w:fill="F2F2F2"/>
+      </w:pPr>
+      <w:r>
+        <w:rPr>
+          <w:rFonts w:ascii="Consolas" w:hAnsi="Consolas"/>
+          <w:sz w:val="18"/>
+        </w:rPr>
+        <w:t xml:space="preserve">    public function set(string $key, ?string $value, User $actor, ...): void</w:t>
+      </w:r>
+    </w:p>
+    <w:p>
+      <w:pPr>
+        <w:ind w:left="240"/>
+        <w:spacing w:after="0"/>
+        <w:shd w:val="clear" w:fill="F2F2F2"/>
+      </w:pPr>
+      <w:r>
+        <w:rPr>
+          <w:rFonts w:ascii="Consolas" w:hAnsi="Consolas"/>
+          <w:sz w:val="18"/>
+        </w:rPr>
+        <w:t xml:space="preserve">    {</w:t>
+      </w:r>
+    </w:p>
+    <w:p>
+      <w:pPr>
+        <w:ind w:left="240"/>
+        <w:spacing w:after="0"/>
+        <w:shd w:val="clear" w:fill="F2F2F2"/>
+      </w:pPr>
+      <w:r>
+        <w:rPr>
+          <w:rFonts w:ascii="Consolas" w:hAnsi="Consolas"/>
+          <w:sz w:val="18"/>
+        </w:rPr>
+        <w:t xml:space="preserve">        Setting::query()-&gt;updateOrCreate(['key' =&gt; $key], [...]);</w:t>
+      </w:r>
+    </w:p>
+    <w:p>
+      <w:pPr>
+        <w:ind w:left="240"/>
+        <w:spacing w:after="0"/>
+        <w:shd w:val="clear" w:fill="F2F2F2"/>
+      </w:pPr>
+      <w:r>
+        <w:rPr>
+          <w:rFonts w:ascii="Consolas" w:hAnsi="Consolas"/>
+          <w:sz w:val="18"/>
+        </w:rPr>
+        <w:t xml:space="preserve">        $this-&gt;cache[$key] = $value;</w:t>
+      </w:r>
+    </w:p>
+    <w:p>
+      <w:pPr>
+        <w:ind w:left="240"/>
+        <w:spacing w:after="0"/>
+        <w:shd w:val="clear" w:fill="F2F2F2"/>
+      </w:pPr>
+      <w:r>
+        <w:rPr>
+          <w:rFonts w:ascii="Consolas" w:hAnsi="Consolas"/>
+          <w:sz w:val="18"/>
+        </w:rPr>
+        <w:t xml:space="preserve">    }</w:t>
+      </w:r>
+    </w:p>
+    <w:p>
+      <w:pPr>
+        <w:ind w:left="240"/>
+        <w:spacing w:after="160"/>
+        <w:shd w:val="clear" w:fill="F2F2F2"/>
+      </w:pPr>
+      <w:r>
+        <w:rPr>
+          <w:rFonts w:ascii="Consolas" w:hAnsi="Consolas"/>
+          <w:sz w:val="18"/>
+        </w:rPr>
+        <w:t xml:space="preserve">}</w:t>
+      </w:r>
+    </w:p>
+    <w:p>
+      <w:pPr>
+        <w:spacing w:after="120"/>
+        <w:ind w:left="240"/>
+      </w:pPr>
+      <w:r>
+        <w:rPr>
+          <w:b/>
+        </w:rPr>
+        <w:t xml:space="preserve">Áp dụng cho: </w:t>
+      </w:r>
+      <w:r>
+        <w:t xml:space="preserve">Module Cấu hình hệ thống (Settings) — SettingsController (GET/PUT /api/settings) gọi SettingsManager::instance() để đọc/ghi bảng settings dùng chung cho toàn hệ thống (thông tin cửa hàng, thuế VAT...).</w:t>
+      </w:r>
+    </w:p>
+    <w:p>
+      <w:pPr>
+        <w:spacing w:after="120"/>
+        <w:ind w:left="240"/>
+      </w:pPr>
+      <w:r>
+        <w:rPr>
+          <w:b/>
+        </w:rPr>
+        <w:t xml:space="preserve">Mô tả: </w:t>
+      </w:r>
+      <w:r>
+        <w:t xml:space="preserve">Constructor được khai báo private nên không thể new SettingsManager() từ bên ngoài; cách duy nhất lấy instance là gọi SettingsManager::instance(), kiểm tra $instance tĩnh — có rồi thì trả lại, chưa có thì mới tạo và cache lại (toán tử ??=). Trong lần khởi tạo đầu tiên (request hiện tại), toàn bộ bảng settings được nạp 1 lần vào $cache; những lần gọi instance() sau đó trong cùng request dùng lại instance và cache này thay vì query lại DB.</w:t>
+      </w:r>
+    </w:p>
+    <w:p>
+      <w:pPr>
+        <w:spacing w:after="120"/>
+        <w:ind w:left="240"/>
+      </w:pPr>
+      <w:r>
+        <w:rPr>
+          <w:b/>
+        </w:rPr>
+        <w:t xml:space="preserve">Lý do chọn / Lợi ích: </w:t>
+      </w:r>
+      <w:r>
+        <w:t xml:space="preserve">Đúng yêu cầu nghiệp vụ: settings là cấu hình dùng chung toàn hệ thống, không phải dữ liệu riêng từng request — Singleton đảm bảo chỉ có 1 điểm đọc/ghi duy nhất, tránh mỗi nơi trong code tự query bảng settings theo cách riêng; cache trong instance giúp giảm query lặp lại khi 1 request cần đọc nhiều key settings khác nhau.</w:t>
+      </w:r>
+    </w:p>
+    <w:p>
+      <w:pPr>
+        <w:spacing w:after="120"/>
+        <w:ind w:left="240"/>
+      </w:pPr>
+      <w:r>
+        <w:rPr>
+          <w:b/>
+        </w:rPr>
+        <w:t xml:space="preserve">Hạn chế: </w:t>
+      </w:r>
+      <w:r>
+        <w:t xml:space="preserve">PHP xử lý mỗi request trong 1 tiến trình riêng (không giữ state giữa các request như một ứng dụng long-running), nên đây là "Singleton theo vòng đời request" — mỗi request mới sẽ tạo lại instance và nạp lại cache từ DB (không phải Singleton toàn tiến trình như trong Java/C++); nếu settings bị đổi từ tiến trình khác trong lúc request đang chạy thì cache cũng không tự cập nhật — chấp nhận đánh đổi vì settings rất ít khi đổi giữa 2 request liền nhau.</w:t>
       </w:r>
     </w:p>
     <w:sectPr>

</xml_diff>